<commit_message>
Update other certificates script with new templates and regenerated certificates
https://claude.ai/code/session_01XbHfH1b8kg1rYEG4wXTtxY
</commit_message>
<xml_diff>
--- a/certificates/إيمان_بنت_علي_البدر.docx
+++ b/certificates/إيمان_بنت_علي_البدر.docx
@@ -139,7 +139,7 @@
                                 <w:szCs w:val="28"/>
                                 <w14:ligatures w14:val="none"/>
                               </w:rPr>
-                              <w:t>لجنة  الأنشطة الطلابية</w:t>
+                              <w:t>Student Activities Committee</w:t>
                             </w:r>
                             <w:r>
                               <w:rPr>
@@ -298,7 +298,7 @@
                           <w:szCs w:val="28"/>
                           <w14:ligatures w14:val="none"/>
                         </w:rPr>
-                        <w:t>لجنة  الأنشطة الطلابية</w:t>
+                        <w:t>Student Activities Committee</w:t>
                       </w:r>
                       <w:r>
                         <w:rPr>

</xml_diff>

<commit_message>
Regenerate all 31 certificates with new templates
https://claude.ai/code/session_01XbHfH1b8kg1rYEG4wXTtxY
</commit_message>
<xml_diff>
--- a/certificates/إيمان_بنت_علي_البدر.docx
+++ b/certificates/إيمان_بنت_علي_البدر.docx
@@ -15,7 +15,713 @@
         <mc:AlternateContent>
           <mc:Choice Requires="wps">
             <w:drawing>
-              <wp:anchor distT="0" distB="0" distL="114300" distR="114300" simplePos="0" relativeHeight="251666432" behindDoc="0" locked="0" layoutInCell="1" allowOverlap="1" wp14:anchorId="2D96A977" wp14:editId="1ACFF360">
+              <wp:anchor distT="0" distB="0" distL="114300" distR="114300" simplePos="0" relativeHeight="251664384" behindDoc="0" locked="0" layoutInCell="1" allowOverlap="1" wp14:anchorId="4BEF5500" wp14:editId="21F49F25">
+                <wp:simplePos x="0" y="0"/>
+                <wp:positionH relativeFrom="margin">
+                  <wp:posOffset>4556125</wp:posOffset>
+                </wp:positionH>
+                <wp:positionV relativeFrom="paragraph">
+                  <wp:posOffset>2282825</wp:posOffset>
+                </wp:positionV>
+                <wp:extent cx="4744720" cy="3168650"/>
+                <wp:effectExtent l="0" t="0" r="0" b="0"/>
+                <wp:wrapNone/>
+                <wp:docPr id="1021757631" name="Text Box 1"/>
+                <wp:cNvGraphicFramePr/>
+                <a:graphic xmlns:a="http://schemas.openxmlformats.org/drawingml/2006/main">
+                  <a:graphicData uri="http://schemas.microsoft.com/office/word/2010/wordprocessingShape">
+                    <wps:wsp>
+                      <wps:cNvSpPr txBox="1"/>
+                      <wps:spPr>
+                        <a:xfrm>
+                          <a:off x="0" y="0"/>
+                          <a:ext cx="4744720" cy="3168650"/>
+                        </a:xfrm>
+                        <a:prstGeom prst="rect">
+                          <a:avLst/>
+                        </a:prstGeom>
+                        <a:noFill/>
+                        <a:ln w="6350">
+                          <a:noFill/>
+                        </a:ln>
+                      </wps:spPr>
+                      <wps:txbx>
+                        <w:txbxContent>
+                          <w:p>
+                            <w:pPr>
+                              <w:spacing w:after="0" w:line="240" w:lineRule="auto"/>
+                              <w:jc w:val="center"/>
+                              <w:rPr>
+                                <w:rFonts w:ascii="Frutiger LT Arabic 45 Light" w:eastAsia="Times New Roman" w:hAnsi="Frutiger LT Arabic 45 Light" w:cs="Frutiger LT Arabic 45 Light"/>
+                                <w:color w:val="156082" w:themeColor="accent1"/>
+                                <w:kern w:val="0"/>
+                                <w:sz w:val="28"/>
+                                <w:szCs w:val="28"/>
+                                <w:rtl/>
+                                <w14:ligatures w14:val="none"/>
+                              </w:rPr>
+                            </w:pPr>
+                            <w:r>
+                              <w:rPr>
+                                <w:rFonts w:ascii="Frutiger LT Arabic 45 Light" w:eastAsia="Times New Roman" w:hAnsi="Frutiger LT Arabic 45 Light" w:cs="Frutiger LT Arabic 45 Light" w:hint="cs"/>
+                                <w:color w:val="156082" w:themeColor="accent1"/>
+                                <w:kern w:val="0"/>
+                                <w:sz w:val="28"/>
+                                <w:szCs w:val="28"/>
+                                <w:rtl/>
+                                <w14:ligatures w14:val="none"/>
+                              </w:rPr>
+                              <w:t>يسر كلية الحوسبة والمعلوماتية بالجامعة السعودية ال</w:t>
+                            </w:r>
+                            <w:r>
+                              <w:rPr>
+                                <w:rFonts w:ascii="Frutiger LT Arabic 45 Light" w:eastAsia="Times New Roman" w:hAnsi="Frutiger LT Arabic 45 Light" w:cs="Frutiger LT Arabic 45 Light" w:hint="cs"/>
+                                <w:color w:val="156082" w:themeColor="accent1"/>
+                                <w:kern w:val="0"/>
+                                <w:sz w:val="28"/>
+                                <w:szCs w:val="28"/>
+                                <w:rtl/>
+                                <w14:ligatures w14:val="none"/>
+                              </w:rPr>
+                              <w:t>إ</w:t>
+                            </w:r>
+                            <w:r>
+                              <w:rPr>
+                                <w:rFonts w:ascii="Frutiger LT Arabic 45 Light" w:eastAsia="Times New Roman" w:hAnsi="Frutiger LT Arabic 45 Light" w:cs="Frutiger LT Arabic 45 Light" w:hint="cs"/>
+                                <w:color w:val="156082" w:themeColor="accent1"/>
+                                <w:kern w:val="0"/>
+                                <w:sz w:val="28"/>
+                                <w:szCs w:val="28"/>
+                                <w:rtl/>
+                                <w14:ligatures w14:val="none"/>
+                              </w:rPr>
+                              <w:t>لكترونية</w:t>
+                            </w:r>
+                          </w:p>
+                          <w:p>
+                            <w:pPr>
+                              <w:spacing w:after="0" w:line="240" w:lineRule="auto"/>
+                              <w:jc w:val="center"/>
+                              <w:rPr>
+                                <w:rFonts w:ascii="Frutiger LT Arabic 45 Light" w:eastAsia="Times New Roman" w:hAnsi="Frutiger LT Arabic 45 Light" w:cs="Frutiger LT Arabic 45 Light"/>
+                                <w:color w:val="156082" w:themeColor="accent1"/>
+                                <w:kern w:val="0"/>
+                                <w:sz w:val="28"/>
+                                <w:szCs w:val="28"/>
+                                <w:rtl/>
+                                <w14:ligatures w14:val="none"/>
+                              </w:rPr>
+                            </w:pPr>
+                            <w:r>
+                              <w:rPr>
+                                <w:rFonts w:ascii="Frutiger LT Arabic 45 Light" w:eastAsia="Times New Roman" w:hAnsi="Frutiger LT Arabic 45 Light" w:cs="Frutiger LT Arabic 45 Light" w:hint="cs"/>
+                                <w:color w:val="156082" w:themeColor="accent1"/>
+                                <w:kern w:val="0"/>
+                                <w:sz w:val="28"/>
+                                <w:szCs w:val="28"/>
+                                <w:rtl/>
+                                <w14:ligatures w14:val="none"/>
+                              </w:rPr>
+                              <w:t>أن تتقدم بوافر الشكر والتقدير</w:t>
+                            </w:r>
+                          </w:p>
+                          <w:p>
+                            <w:pPr>
+                              <w:bidi/>
+                              <w:spacing w:after="0" w:line="240" w:lineRule="auto"/>
+                              <w:jc w:val="center"/>
+                              <w:rPr>
+                                <w:rFonts w:ascii="Frutiger LT Arabic 45 Light" w:eastAsia="Times New Roman" w:hAnsi="Frutiger LT Arabic 45 Light" w:cs="Frutiger LT Arabic 45 Light"/>
+                                <w:color w:val="156082" w:themeColor="accent1"/>
+                                <w:kern w:val="0"/>
+                                <w:sz w:val="28"/>
+                                <w:szCs w:val="28"/>
+                                <w14:ligatures w14:val="none"/>
+                              </w:rPr>
+                            </w:pPr>
+                            <w:r>
+                              <w:rPr>
+                                <w:rFonts w:ascii="Frutiger LT Arabic 45 Light" w:eastAsia="Times New Roman" w:hAnsi="Frutiger LT Arabic 45 Light" w:cs="Frutiger LT Arabic 45 Light"/>
+                                <w:color w:val="156082" w:themeColor="accent1"/>
+                                <w:kern w:val="0"/>
+                                <w:sz w:val="28"/>
+                                <w:szCs w:val="28"/>
+                                <w14:ligatures w14:val="none"/>
+                              </w:rPr>
+                              <w:t>للمحاضرة</w:t>
+                            </w:r>
+                            <w:r>
+                              <w:rPr>
+                                <w:rFonts w:ascii="Frutiger LT Arabic 45 Light" w:eastAsia="Times New Roman" w:hAnsi="Frutiger LT Arabic 45 Light" w:cs="Frutiger LT Arabic 45 Light" w:hint="cs"/>
+                                <w:color w:val="156082" w:themeColor="accent1"/>
+                                <w:kern w:val="0"/>
+                                <w:sz w:val="28"/>
+                                <w:szCs w:val="28"/>
+                                <w:rtl/>
+                                <w14:ligatures w14:val="none"/>
+                              </w:rPr>
+                              <w:t>/</w:t>
+                            </w:r>
+                            <w:r>
+                              <w:rPr>
+                                <w:rFonts w:ascii="Frutiger LT Arabic 45 Light" w:eastAsia="Times New Roman" w:hAnsi="Frutiger LT Arabic 45 Light" w:cs="Frutiger LT Arabic 45 Light" w:hint="cs"/>
+                                <w:color w:val="156082" w:themeColor="accent1"/>
+                                <w:kern w:val="0"/>
+                                <w:sz w:val="28"/>
+                                <w:szCs w:val="28"/>
+                                <w:rtl/>
+                                <w14:ligatures w14:val="none"/>
+                              </w:rPr>
+                              <w:t xml:space="preserve"> </w:t>
+                            </w:r>
+                            <w:r>
+                              <w:rPr>
+                                <w:rFonts w:ascii="Frutiger LT Arabic 45 Light" w:eastAsia="Times New Roman" w:hAnsi="Frutiger LT Arabic 45 Light" w:cs="Frutiger LT Arabic 45 Light"/>
+                                <w:color w:val="156082" w:themeColor="accent1"/>
+                                <w:kern w:val="0"/>
+                                <w:sz w:val="28"/>
+                                <w:szCs w:val="28"/>
+                                <w14:ligatures w14:val="none"/>
+                              </w:rPr>
+                              <w:t>إيمان بنت علي البدر</w:t>
+                            </w:r>
+                            <w:r>
+                              <w:rPr>
+                                <w:rFonts w:ascii="Frutiger LT Arabic 45 Light" w:eastAsia="Times New Roman" w:hAnsi="Frutiger LT Arabic 45 Light" w:cs="Frutiger LT Arabic 45 Light"/>
+                                <w:color w:val="156082" w:themeColor="accent1"/>
+                                <w:kern w:val="0"/>
+                                <w:sz w:val="28"/>
+                                <w:szCs w:val="28"/>
+                                <w14:ligatures w14:val="none"/>
+                              </w:rPr>
+                              <w:t xml:space="preserve"> </w:t>
+                            </w:r>
+                          </w:p>
+                          <w:p>
+                            <w:pPr>
+                              <w:bidi/>
+                              <w:spacing w:after="0" w:line="240" w:lineRule="auto"/>
+                              <w:jc w:val="center"/>
+                              <w:rPr>
+                                <w:rFonts w:ascii="Frutiger LT Arabic 45 Light" w:eastAsia="Times New Roman" w:hAnsi="Frutiger LT Arabic 45 Light" w:cs="Frutiger LT Arabic 45 Light"/>
+                                <w:color w:val="156082" w:themeColor="accent1"/>
+                                <w:kern w:val="0"/>
+                                <w:sz w:val="28"/>
+                                <w:szCs w:val="28"/>
+                                <w14:ligatures w14:val="none"/>
+                              </w:rPr>
+                            </w:pPr>
+                            <w:r>
+                              <w:rPr>
+                                <w:rFonts w:ascii="Frutiger LT Arabic 45 Light" w:eastAsia="Times New Roman" w:hAnsi="Frutiger LT Arabic 45 Light" w:cs="Frutiger LT Arabic 45 Light"/>
+                                <w:color w:val="156082" w:themeColor="accent1"/>
+                                <w:kern w:val="0"/>
+                                <w:sz w:val="28"/>
+                                <w:szCs w:val="28"/>
+                                <w:rtl/>
+                                <w14:ligatures w14:val="none"/>
+                              </w:rPr>
+                              <w:t>على جهودها المميزة ومساهمتها الفاعلة في أعمال</w:t>
+                            </w:r>
+                            <w:r>
+                              <w:rPr>
+                                <w:rFonts w:ascii="Frutiger LT Arabic 45 Light" w:eastAsia="Times New Roman" w:hAnsi="Frutiger LT Arabic 45 Light" w:cs="Frutiger LT Arabic 45 Light" w:hint="cs"/>
+                                <w:color w:val="156082" w:themeColor="accent1"/>
+                                <w:kern w:val="0"/>
+                                <w:sz w:val="28"/>
+                                <w:szCs w:val="28"/>
+                                <w:rtl/>
+                                <w14:ligatures w14:val="none"/>
+                              </w:rPr>
+                              <w:t xml:space="preserve"> </w:t>
+                            </w:r>
+                            <w:r>
+                              <w:rPr>
+                                <w:rFonts w:ascii="Frutiger LT Arabic 45 Light" w:eastAsia="Times New Roman" w:hAnsi="Frutiger LT Arabic 45 Light" w:cs="Frutiger LT Arabic 45 Light"/>
+                                <w:color w:val="156082" w:themeColor="accent1"/>
+                                <w:kern w:val="0"/>
+                                <w:sz w:val="28"/>
+                                <w:szCs w:val="28"/>
+                                <w14:ligatures w14:val="none"/>
+                              </w:rPr>
+                              <w:t>لجنة  الأنشطة الطلابية</w:t>
+                            </w:r>
+                            <w:r>
+                              <w:rPr>
+                                <w:rFonts w:ascii="Frutiger LT Arabic 45 Light" w:eastAsia="Times New Roman" w:hAnsi="Frutiger LT Arabic 45 Light" w:cs="Frutiger LT Arabic 45 Light" w:hint="cs"/>
+                                <w:color w:val="156082" w:themeColor="accent1"/>
+                                <w:kern w:val="0"/>
+                                <w:sz w:val="28"/>
+                                <w:szCs w:val="28"/>
+                                <w:rtl/>
+                                <w14:ligatures w14:val="none"/>
+                              </w:rPr>
+                              <w:t xml:space="preserve"> </w:t>
+                            </w:r>
+                            <w:r>
+                              <w:rPr>
+                                <w:rFonts w:ascii="Frutiger LT Arabic 45 Light" w:eastAsia="Times New Roman" w:hAnsi="Frutiger LT Arabic 45 Light" w:cs="Frutiger LT Arabic 45 Light" w:hint="cs"/>
+                                <w:color w:val="156082" w:themeColor="accent1"/>
+                                <w:kern w:val="0"/>
+                                <w:sz w:val="28"/>
+                                <w:szCs w:val="28"/>
+                                <w:rtl/>
+                                <w14:ligatures w14:val="none"/>
+                              </w:rPr>
+                              <w:t>ب</w:t>
+                            </w:r>
+                            <w:r>
+                              <w:rPr>
+                                <w:rFonts w:ascii="Frutiger LT Arabic 45 Light" w:eastAsia="Times New Roman" w:hAnsi="Frutiger LT Arabic 45 Light" w:cs="Frutiger LT Arabic 45 Light" w:hint="cs"/>
+                                <w:color w:val="156082" w:themeColor="accent1"/>
+                                <w:kern w:val="0"/>
+                                <w:sz w:val="28"/>
+                                <w:szCs w:val="28"/>
+                                <w:rtl/>
+                                <w14:ligatures w14:val="none"/>
+                              </w:rPr>
+                              <w:t>كلية الحوسبة</w:t>
+                            </w:r>
+                            <w:r>
+                              <w:rPr>
+                                <w:rFonts w:ascii="Frutiger LT Arabic 45 Light" w:eastAsia="Times New Roman" w:hAnsi="Frutiger LT Arabic 45 Light" w:cs="Frutiger LT Arabic 45 Light" w:hint="cs"/>
+                                <w:color w:val="156082" w:themeColor="accent1"/>
+                                <w:kern w:val="0"/>
+                                <w:sz w:val="28"/>
+                                <w:szCs w:val="28"/>
+                                <w:rtl/>
+                                <w14:ligatures w14:val="none"/>
+                              </w:rPr>
+                              <w:t xml:space="preserve"> </w:t>
+                            </w:r>
+                            <w:r>
+                              <w:rPr>
+                                <w:rFonts w:ascii="Frutiger LT Arabic 45 Light" w:eastAsia="Times New Roman" w:hAnsi="Frutiger LT Arabic 45 Light" w:cs="Frutiger LT Arabic 45 Light" w:hint="cs"/>
+                                <w:color w:val="156082" w:themeColor="accent1"/>
+                                <w:kern w:val="0"/>
+                                <w:sz w:val="28"/>
+                                <w:szCs w:val="28"/>
+                                <w:rtl/>
+                                <w14:ligatures w14:val="none"/>
+                              </w:rPr>
+                              <w:t xml:space="preserve">والمعلوماتية </w:t>
+                            </w:r>
+                            <w:r>
+                              <w:rPr>
+                                <w:rFonts w:ascii="Frutiger LT Arabic 45 Light" w:eastAsia="Times New Roman" w:hAnsi="Frutiger LT Arabic 45 Light" w:cs="Frutiger LT Arabic 45 Light" w:hint="cs"/>
+                                <w:color w:val="156082" w:themeColor="accent1"/>
+                                <w:kern w:val="0"/>
+                                <w:sz w:val="28"/>
+                                <w:szCs w:val="28"/>
+                                <w:rtl/>
+                                <w14:ligatures w14:val="none"/>
+                              </w:rPr>
+                              <w:t>خلال العام الجامعي ١٤٤٧ هـ</w:t>
+                            </w:r>
+                          </w:p>
+                          <w:p>
+                            <w:pPr>
+                              <w:bidi/>
+                              <w:spacing w:after="0" w:line="240" w:lineRule="auto"/>
+                              <w:jc w:val="center"/>
+                              <w:rPr>
+                                <w:rFonts w:ascii="Frutiger LT Arabic 45 Light" w:eastAsia="Times New Roman" w:hAnsi="Frutiger LT Arabic 45 Light" w:cs="Frutiger LT Arabic 45 Light"/>
+                                <w:color w:val="156082" w:themeColor="accent1"/>
+                                <w:kern w:val="0"/>
+                                <w:sz w:val="28"/>
+                                <w:szCs w:val="28"/>
+                                <w:rtl/>
+                                <w14:ligatures w14:val="none"/>
+                              </w:rPr>
+                            </w:pPr>
+                          </w:p>
+                          <w:p>
+                            <w:pPr>
+                              <w:bidi/>
+                              <w:spacing w:after="0" w:line="240" w:lineRule="auto"/>
+                              <w:jc w:val="center"/>
+                              <w:rPr>
+                                <w:rFonts w:ascii="Frutiger LT Arabic 45 Light" w:eastAsia="Times New Roman" w:hAnsi="Frutiger LT Arabic 45 Light" w:cs="Frutiger LT Arabic 45 Light"/>
+                                <w:color w:val="156082" w:themeColor="accent1"/>
+                                <w:kern w:val="0"/>
+                                <w:sz w:val="28"/>
+                                <w:szCs w:val="28"/>
+                                <w14:ligatures w14:val="none"/>
+                              </w:rPr>
+                            </w:pPr>
+                            <w:r>
+                              <w:rPr>
+                                <w:rFonts w:ascii="Frutiger LT Arabic 45 Light" w:eastAsia="Times New Roman" w:hAnsi="Frutiger LT Arabic 45 Light" w:cs="Frutiger LT Arabic 45 Light" w:hint="cs"/>
+                                <w:color w:val="156082" w:themeColor="accent1"/>
+                                <w:kern w:val="0"/>
+                                <w:sz w:val="28"/>
+                                <w:szCs w:val="28"/>
+                                <w:rtl/>
+                                <w14:ligatures w14:val="none"/>
+                              </w:rPr>
+                              <w:t>سائلين المولى لها مزِيدًا من النجاح والتقدم</w:t>
+                            </w:r>
+                          </w:p>
+                        </w:txbxContent>
+                      </wps:txbx>
+                      <wps:bodyPr rot="0" spcFirstLastPara="0" vertOverflow="overflow" horzOverflow="overflow" vert="horz" wrap="square" lIns="91440" tIns="45720" rIns="91440" bIns="45720" numCol="1" spcCol="0" rtlCol="1" fromWordArt="0" anchor="t" anchorCtr="0" forceAA="0" compatLnSpc="1">
+                        <a:prstTxWarp prst="textNoShape">
+                          <a:avLst/>
+                        </a:prstTxWarp>
+                        <a:noAutofit/>
+                      </wps:bodyPr>
+                    </wps:wsp>
+                  </a:graphicData>
+                </a:graphic>
+                <wp14:sizeRelH relativeFrom="margin">
+                  <wp14:pctWidth>0</wp14:pctWidth>
+                </wp14:sizeRelH>
+                <wp14:sizeRelV relativeFrom="margin">
+                  <wp14:pctHeight>0</wp14:pctHeight>
+                </wp14:sizeRelV>
+              </wp:anchor>
+            </w:drawing>
+          </mc:Choice>
+          <mc:Fallback>
+            <w:pict>
+              <v:shapetype w14:anchorId="4BEF5500" id="_x0000_t202" coordsize="21600,21600" o:spt="202" path="m,l,21600r21600,l21600,xe">
+                <v:stroke joinstyle="miter"/>
+                <v:path gradientshapeok="t" o:connecttype="rect"/>
+              </v:shapetype>
+              <v:shape id="Text Box 1" o:spid="_x0000_s1026" type="#_x0000_t202" style="position:absolute;left:0;text-align:left;margin-left:358.75pt;margin-top:179.75pt;width:373.6pt;height:249.5pt;z-index:251664384;visibility:visible;mso-wrap-style:square;mso-width-percent:0;mso-height-percent:0;mso-wrap-distance-left:9pt;mso-wrap-distance-top:0;mso-wrap-distance-right:9pt;mso-wrap-distance-bottom:0;mso-position-horizontal:absolute;mso-position-horizontal-relative:margin;mso-position-vertical:absolute;mso-position-vertical-relative:text;mso-width-percent:0;mso-height-percent:0;mso-width-relative:margin;mso-height-relative:margin;v-text-anchor:top" o:gfxdata="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" filled="f" stroked="f" strokeweight=".5pt">
+                <v:textbox>
+                  <w:txbxContent>
+                    <w:p>
+                      <w:pPr>
+                        <w:spacing w:after="0" w:line="240" w:lineRule="auto"/>
+                        <w:jc w:val="center"/>
+                        <w:rPr>
+                          <w:rFonts w:ascii="Frutiger LT Arabic 45 Light" w:eastAsia="Times New Roman" w:hAnsi="Frutiger LT Arabic 45 Light" w:cs="Frutiger LT Arabic 45 Light"/>
+                          <w:color w:val="156082" w:themeColor="accent1"/>
+                          <w:kern w:val="0"/>
+                          <w:sz w:val="28"/>
+                          <w:szCs w:val="28"/>
+                          <w:rtl/>
+                          <w14:ligatures w14:val="none"/>
+                        </w:rPr>
+                      </w:pPr>
+                      <w:r>
+                        <w:rPr>
+                          <w:rFonts w:ascii="Frutiger LT Arabic 45 Light" w:eastAsia="Times New Roman" w:hAnsi="Frutiger LT Arabic 45 Light" w:cs="Frutiger LT Arabic 45 Light" w:hint="cs"/>
+                          <w:color w:val="156082" w:themeColor="accent1"/>
+                          <w:kern w:val="0"/>
+                          <w:sz w:val="28"/>
+                          <w:szCs w:val="28"/>
+                          <w:rtl/>
+                          <w14:ligatures w14:val="none"/>
+                        </w:rPr>
+                        <w:t>يسر كلية الحوسبة والمعلوماتية بالجامعة السعودية ال</w:t>
+                      </w:r>
+                      <w:r>
+                        <w:rPr>
+                          <w:rFonts w:ascii="Frutiger LT Arabic 45 Light" w:eastAsia="Times New Roman" w:hAnsi="Frutiger LT Arabic 45 Light" w:cs="Frutiger LT Arabic 45 Light" w:hint="cs"/>
+                          <w:color w:val="156082" w:themeColor="accent1"/>
+                          <w:kern w:val="0"/>
+                          <w:sz w:val="28"/>
+                          <w:szCs w:val="28"/>
+                          <w:rtl/>
+                          <w14:ligatures w14:val="none"/>
+                        </w:rPr>
+                        <w:t>إ</w:t>
+                      </w:r>
+                      <w:r>
+                        <w:rPr>
+                          <w:rFonts w:ascii="Frutiger LT Arabic 45 Light" w:eastAsia="Times New Roman" w:hAnsi="Frutiger LT Arabic 45 Light" w:cs="Frutiger LT Arabic 45 Light" w:hint="cs"/>
+                          <w:color w:val="156082" w:themeColor="accent1"/>
+                          <w:kern w:val="0"/>
+                          <w:sz w:val="28"/>
+                          <w:szCs w:val="28"/>
+                          <w:rtl/>
+                          <w14:ligatures w14:val="none"/>
+                        </w:rPr>
+                        <w:t>لكترونية</w:t>
+                      </w:r>
+                    </w:p>
+                    <w:p>
+                      <w:pPr>
+                        <w:spacing w:after="0" w:line="240" w:lineRule="auto"/>
+                        <w:jc w:val="center"/>
+                        <w:rPr>
+                          <w:rFonts w:ascii="Frutiger LT Arabic 45 Light" w:eastAsia="Times New Roman" w:hAnsi="Frutiger LT Arabic 45 Light" w:cs="Frutiger LT Arabic 45 Light"/>
+                          <w:color w:val="156082" w:themeColor="accent1"/>
+                          <w:kern w:val="0"/>
+                          <w:sz w:val="28"/>
+                          <w:szCs w:val="28"/>
+                          <w:rtl/>
+                          <w14:ligatures w14:val="none"/>
+                        </w:rPr>
+                      </w:pPr>
+                      <w:r>
+                        <w:rPr>
+                          <w:rFonts w:ascii="Frutiger LT Arabic 45 Light" w:eastAsia="Times New Roman" w:hAnsi="Frutiger LT Arabic 45 Light" w:cs="Frutiger LT Arabic 45 Light" w:hint="cs"/>
+                          <w:color w:val="156082" w:themeColor="accent1"/>
+                          <w:kern w:val="0"/>
+                          <w:sz w:val="28"/>
+                          <w:szCs w:val="28"/>
+                          <w:rtl/>
+                          <w14:ligatures w14:val="none"/>
+                        </w:rPr>
+                        <w:t>أن تتقدم بوافر الشكر والتقدير</w:t>
+                      </w:r>
+                    </w:p>
+                    <w:p>
+                      <w:pPr>
+                        <w:bidi/>
+                        <w:spacing w:after="0" w:line="240" w:lineRule="auto"/>
+                        <w:jc w:val="center"/>
+                        <w:rPr>
+                          <w:rFonts w:ascii="Frutiger LT Arabic 45 Light" w:eastAsia="Times New Roman" w:hAnsi="Frutiger LT Arabic 45 Light" w:cs="Frutiger LT Arabic 45 Light"/>
+                          <w:color w:val="156082" w:themeColor="accent1"/>
+                          <w:kern w:val="0"/>
+                          <w:sz w:val="28"/>
+                          <w:szCs w:val="28"/>
+                          <w14:ligatures w14:val="none"/>
+                        </w:rPr>
+                      </w:pPr>
+                      <w:r>
+                        <w:rPr>
+                          <w:rFonts w:ascii="Frutiger LT Arabic 45 Light" w:eastAsia="Times New Roman" w:hAnsi="Frutiger LT Arabic 45 Light" w:cs="Frutiger LT Arabic 45 Light"/>
+                          <w:color w:val="156082" w:themeColor="accent1"/>
+                          <w:kern w:val="0"/>
+                          <w:sz w:val="28"/>
+                          <w:szCs w:val="28"/>
+                          <w14:ligatures w14:val="none"/>
+                        </w:rPr>
+                        <w:t>للمحاضرة</w:t>
+                      </w:r>
+                      <w:r>
+                        <w:rPr>
+                          <w:rFonts w:ascii="Frutiger LT Arabic 45 Light" w:eastAsia="Times New Roman" w:hAnsi="Frutiger LT Arabic 45 Light" w:cs="Frutiger LT Arabic 45 Light" w:hint="cs"/>
+                          <w:color w:val="156082" w:themeColor="accent1"/>
+                          <w:kern w:val="0"/>
+                          <w:sz w:val="28"/>
+                          <w:szCs w:val="28"/>
+                          <w:rtl/>
+                          <w14:ligatures w14:val="none"/>
+                        </w:rPr>
+                        <w:t>/</w:t>
+                      </w:r>
+                      <w:r>
+                        <w:rPr>
+                          <w:rFonts w:ascii="Frutiger LT Arabic 45 Light" w:eastAsia="Times New Roman" w:hAnsi="Frutiger LT Arabic 45 Light" w:cs="Frutiger LT Arabic 45 Light" w:hint="cs"/>
+                          <w:color w:val="156082" w:themeColor="accent1"/>
+                          <w:kern w:val="0"/>
+                          <w:sz w:val="28"/>
+                          <w:szCs w:val="28"/>
+                          <w:rtl/>
+                          <w14:ligatures w14:val="none"/>
+                        </w:rPr>
+                        <w:t xml:space="preserve"> </w:t>
+                      </w:r>
+                      <w:r>
+                        <w:rPr>
+                          <w:rFonts w:ascii="Frutiger LT Arabic 45 Light" w:eastAsia="Times New Roman" w:hAnsi="Frutiger LT Arabic 45 Light" w:cs="Frutiger LT Arabic 45 Light"/>
+                          <w:color w:val="156082" w:themeColor="accent1"/>
+                          <w:kern w:val="0"/>
+                          <w:sz w:val="28"/>
+                          <w:szCs w:val="28"/>
+                          <w14:ligatures w14:val="none"/>
+                        </w:rPr>
+                        <w:t>إيمان بنت علي البدر</w:t>
+                      </w:r>
+                      <w:r>
+                        <w:rPr>
+                          <w:rFonts w:ascii="Frutiger LT Arabic 45 Light" w:eastAsia="Times New Roman" w:hAnsi="Frutiger LT Arabic 45 Light" w:cs="Frutiger LT Arabic 45 Light"/>
+                          <w:color w:val="156082" w:themeColor="accent1"/>
+                          <w:kern w:val="0"/>
+                          <w:sz w:val="28"/>
+                          <w:szCs w:val="28"/>
+                          <w14:ligatures w14:val="none"/>
+                        </w:rPr>
+                        <w:t xml:space="preserve"> </w:t>
+                      </w:r>
+                    </w:p>
+                    <w:p>
+                      <w:pPr>
+                        <w:bidi/>
+                        <w:spacing w:after="0" w:line="240" w:lineRule="auto"/>
+                        <w:jc w:val="center"/>
+                        <w:rPr>
+                          <w:rFonts w:ascii="Frutiger LT Arabic 45 Light" w:eastAsia="Times New Roman" w:hAnsi="Frutiger LT Arabic 45 Light" w:cs="Frutiger LT Arabic 45 Light"/>
+                          <w:color w:val="156082" w:themeColor="accent1"/>
+                          <w:kern w:val="0"/>
+                          <w:sz w:val="28"/>
+                          <w:szCs w:val="28"/>
+                          <w14:ligatures w14:val="none"/>
+                        </w:rPr>
+                      </w:pPr>
+                      <w:r>
+                        <w:rPr>
+                          <w:rFonts w:ascii="Frutiger LT Arabic 45 Light" w:eastAsia="Times New Roman" w:hAnsi="Frutiger LT Arabic 45 Light" w:cs="Frutiger LT Arabic 45 Light"/>
+                          <w:color w:val="156082" w:themeColor="accent1"/>
+                          <w:kern w:val="0"/>
+                          <w:sz w:val="28"/>
+                          <w:szCs w:val="28"/>
+                          <w:rtl/>
+                          <w14:ligatures w14:val="none"/>
+                        </w:rPr>
+                        <w:t>على جهودها المميزة ومساهمتها الفاعلة في أعمال</w:t>
+                      </w:r>
+                      <w:r>
+                        <w:rPr>
+                          <w:rFonts w:ascii="Frutiger LT Arabic 45 Light" w:eastAsia="Times New Roman" w:hAnsi="Frutiger LT Arabic 45 Light" w:cs="Frutiger LT Arabic 45 Light" w:hint="cs"/>
+                          <w:color w:val="156082" w:themeColor="accent1"/>
+                          <w:kern w:val="0"/>
+                          <w:sz w:val="28"/>
+                          <w:szCs w:val="28"/>
+                          <w:rtl/>
+                          <w14:ligatures w14:val="none"/>
+                        </w:rPr>
+                        <w:t xml:space="preserve"> </w:t>
+                      </w:r>
+                      <w:r>
+                        <w:rPr>
+                          <w:rFonts w:ascii="Frutiger LT Arabic 45 Light" w:eastAsia="Times New Roman" w:hAnsi="Frutiger LT Arabic 45 Light" w:cs="Frutiger LT Arabic 45 Light"/>
+                          <w:color w:val="156082" w:themeColor="accent1"/>
+                          <w:kern w:val="0"/>
+                          <w:sz w:val="28"/>
+                          <w:szCs w:val="28"/>
+                          <w14:ligatures w14:val="none"/>
+                        </w:rPr>
+                        <w:t>لجنة  الأنشطة الطلابية</w:t>
+                      </w:r>
+                      <w:r>
+                        <w:rPr>
+                          <w:rFonts w:ascii="Frutiger LT Arabic 45 Light" w:eastAsia="Times New Roman" w:hAnsi="Frutiger LT Arabic 45 Light" w:cs="Frutiger LT Arabic 45 Light" w:hint="cs"/>
+                          <w:color w:val="156082" w:themeColor="accent1"/>
+                          <w:kern w:val="0"/>
+                          <w:sz w:val="28"/>
+                          <w:szCs w:val="28"/>
+                          <w:rtl/>
+                          <w14:ligatures w14:val="none"/>
+                        </w:rPr>
+                        <w:t xml:space="preserve"> </w:t>
+                      </w:r>
+                      <w:r>
+                        <w:rPr>
+                          <w:rFonts w:ascii="Frutiger LT Arabic 45 Light" w:eastAsia="Times New Roman" w:hAnsi="Frutiger LT Arabic 45 Light" w:cs="Frutiger LT Arabic 45 Light" w:hint="cs"/>
+                          <w:color w:val="156082" w:themeColor="accent1"/>
+                          <w:kern w:val="0"/>
+                          <w:sz w:val="28"/>
+                          <w:szCs w:val="28"/>
+                          <w:rtl/>
+                          <w14:ligatures w14:val="none"/>
+                        </w:rPr>
+                        <w:t>ب</w:t>
+                      </w:r>
+                      <w:r>
+                        <w:rPr>
+                          <w:rFonts w:ascii="Frutiger LT Arabic 45 Light" w:eastAsia="Times New Roman" w:hAnsi="Frutiger LT Arabic 45 Light" w:cs="Frutiger LT Arabic 45 Light" w:hint="cs"/>
+                          <w:color w:val="156082" w:themeColor="accent1"/>
+                          <w:kern w:val="0"/>
+                          <w:sz w:val="28"/>
+                          <w:szCs w:val="28"/>
+                          <w:rtl/>
+                          <w14:ligatures w14:val="none"/>
+                        </w:rPr>
+                        <w:t>كلية الحوسبة</w:t>
+                      </w:r>
+                      <w:r>
+                        <w:rPr>
+                          <w:rFonts w:ascii="Frutiger LT Arabic 45 Light" w:eastAsia="Times New Roman" w:hAnsi="Frutiger LT Arabic 45 Light" w:cs="Frutiger LT Arabic 45 Light" w:hint="cs"/>
+                          <w:color w:val="156082" w:themeColor="accent1"/>
+                          <w:kern w:val="0"/>
+                          <w:sz w:val="28"/>
+                          <w:szCs w:val="28"/>
+                          <w:rtl/>
+                          <w14:ligatures w14:val="none"/>
+                        </w:rPr>
+                        <w:t xml:space="preserve"> </w:t>
+                      </w:r>
+                      <w:r>
+                        <w:rPr>
+                          <w:rFonts w:ascii="Frutiger LT Arabic 45 Light" w:eastAsia="Times New Roman" w:hAnsi="Frutiger LT Arabic 45 Light" w:cs="Frutiger LT Arabic 45 Light" w:hint="cs"/>
+                          <w:color w:val="156082" w:themeColor="accent1"/>
+                          <w:kern w:val="0"/>
+                          <w:sz w:val="28"/>
+                          <w:szCs w:val="28"/>
+                          <w:rtl/>
+                          <w14:ligatures w14:val="none"/>
+                        </w:rPr>
+                        <w:t xml:space="preserve">والمعلوماتية </w:t>
+                      </w:r>
+                      <w:r>
+                        <w:rPr>
+                          <w:rFonts w:ascii="Frutiger LT Arabic 45 Light" w:eastAsia="Times New Roman" w:hAnsi="Frutiger LT Arabic 45 Light" w:cs="Frutiger LT Arabic 45 Light" w:hint="cs"/>
+                          <w:color w:val="156082" w:themeColor="accent1"/>
+                          <w:kern w:val="0"/>
+                          <w:sz w:val="28"/>
+                          <w:szCs w:val="28"/>
+                          <w:rtl/>
+                          <w14:ligatures w14:val="none"/>
+                        </w:rPr>
+                        <w:t>خلال العام الجامعي ١٤٤٧ هـ</w:t>
+                      </w:r>
+                    </w:p>
+                    <w:p>
+                      <w:pPr>
+                        <w:bidi/>
+                        <w:spacing w:after="0" w:line="240" w:lineRule="auto"/>
+                        <w:jc w:val="center"/>
+                        <w:rPr>
+                          <w:rFonts w:ascii="Frutiger LT Arabic 45 Light" w:eastAsia="Times New Roman" w:hAnsi="Frutiger LT Arabic 45 Light" w:cs="Frutiger LT Arabic 45 Light"/>
+                          <w:color w:val="156082" w:themeColor="accent1"/>
+                          <w:kern w:val="0"/>
+                          <w:sz w:val="28"/>
+                          <w:szCs w:val="28"/>
+                          <w:rtl/>
+                          <w14:ligatures w14:val="none"/>
+                        </w:rPr>
+                      </w:pPr>
+                    </w:p>
+                    <w:p>
+                      <w:pPr>
+                        <w:bidi/>
+                        <w:spacing w:after="0" w:line="240" w:lineRule="auto"/>
+                        <w:jc w:val="center"/>
+                        <w:rPr>
+                          <w:rFonts w:ascii="Frutiger LT Arabic 45 Light" w:eastAsia="Times New Roman" w:hAnsi="Frutiger LT Arabic 45 Light" w:cs="Frutiger LT Arabic 45 Light"/>
+                          <w:color w:val="156082" w:themeColor="accent1"/>
+                          <w:kern w:val="0"/>
+                          <w:sz w:val="28"/>
+                          <w:szCs w:val="28"/>
+                          <w14:ligatures w14:val="none"/>
+                        </w:rPr>
+                      </w:pPr>
+                      <w:r>
+                        <w:rPr>
+                          <w:rFonts w:ascii="Frutiger LT Arabic 45 Light" w:eastAsia="Times New Roman" w:hAnsi="Frutiger LT Arabic 45 Light" w:cs="Frutiger LT Arabic 45 Light" w:hint="cs"/>
+                          <w:color w:val="156082" w:themeColor="accent1"/>
+                          <w:kern w:val="0"/>
+                          <w:sz w:val="28"/>
+                          <w:szCs w:val="28"/>
+                          <w:rtl/>
+                          <w14:ligatures w14:val="none"/>
+                        </w:rPr>
+                        <w:t>سائلين المولى لها مزِيدًا من النجاح والتقدم</w:t>
+                      </w:r>
+                    </w:p>
+                  </w:txbxContent>
+                </v:textbox>
+                <w10:wrap anchorx="margin"/>
+              </v:shape>
+            </w:pict>
+          </mc:Fallback>
+        </mc:AlternateContent>
+      </w:r>
+      <w:r>
+        <w:rPr>
+          <w:noProof/>
+        </w:rPr>
+        <mc:AlternateContent>
+          <mc:Choice Requires="wps">
+            <w:drawing>
+              <wp:anchor distT="0" distB="0" distL="114300" distR="114300" simplePos="0" relativeHeight="251666432" behindDoc="0" locked="0" layoutInCell="1" allowOverlap="1" wp14:anchorId="2D96A977" wp14:editId="323C0C5C">
                 <wp:simplePos x="0" y="0"/>
                 <wp:positionH relativeFrom="margin">
                   <wp:posOffset>-405114</wp:posOffset>
@@ -128,7 +834,51 @@
                                 <w:szCs w:val="28"/>
                                 <w14:ligatures w14:val="none"/>
                               </w:rPr>
-                              <w:t xml:space="preserve">for her outstanding efforts in her role as </w:t>
+                              <w:t>for her outstanding efforts in her role as</w:t>
+                            </w:r>
+                            <w:r>
+                              <w:rPr>
+                                <w:rFonts w:ascii="Frutiger LT Arabic 45 Light" w:eastAsia="Times New Roman" w:hAnsi="Frutiger LT Arabic 45 Light" w:cs="Frutiger LT Arabic 45 Light"/>
+                                <w:color w:val="002060"/>
+                                <w:kern w:val="0"/>
+                                <w:sz w:val="28"/>
+                                <w:szCs w:val="28"/>
+                                <w14:ligatures w14:val="none"/>
+                              </w:rPr>
+                              <w:t xml:space="preserve"> </w:t>
+                            </w:r>
+                            <w:r>
+                              <w:rPr>
+                                <w:rFonts w:ascii="Frutiger LT Arabic 45 Light" w:eastAsia="Times New Roman" w:hAnsi="Frutiger LT Arabic 45 Light" w:cs="Frutiger LT Arabic 45 Light"/>
+                                <w:color w:val="002060"/>
+                                <w:kern w:val="0"/>
+                                <w:sz w:val="28"/>
+                                <w:szCs w:val="28"/>
+                                <w14:ligatures w14:val="none"/>
+                              </w:rPr>
+                              <w:t>a member of</w:t>
+                            </w:r>
+                            <w:r>
+                              <w:rPr>
+                                <w:rFonts w:ascii="Frutiger LT Arabic 45 Light" w:eastAsia="Times New Roman" w:hAnsi="Frutiger LT Arabic 45 Light" w:cs="Frutiger LT Arabic 45 Light"/>
+                                <w:color w:val="002060"/>
+                                <w:kern w:val="0"/>
+                                <w:sz w:val="28"/>
+                                <w:szCs w:val="28"/>
+                                <w14:ligatures w14:val="none"/>
+                              </w:rPr>
+                              <w:t xml:space="preserve"> the</w:t>
+                            </w:r>
+                            <w:r>
+                              <w:rPr>
+                                <w:rFonts w:ascii="Frutiger LT Arabic 45 Light" w:eastAsia="Times New Roman" w:hAnsi="Frutiger LT Arabic 45 Light" w:cs="Frutiger LT Arabic 45 Light"/>
+                                <w:color w:val="002060"/>
+                                <w:kern w:val="0"/>
+                                <w:sz w:val="28"/>
+                                <w:szCs w:val="28"/>
+                                <w14:ligatures w14:val="none"/>
+                              </w:rPr>
+                              <w:t xml:space="preserve"> </w:t>
                             </w:r>
                             <w:r>
                               <w:rPr>
@@ -199,11 +949,7 @@
           </mc:Choice>
           <mc:Fallback>
             <w:pict>
-              <v:shapetype w14:anchorId="2D96A977" id="_x0000_t202" coordsize="21600,21600" o:spt="202" path="m,l,21600r21600,l21600,xe">
-                <v:stroke joinstyle="miter"/>
-                <v:path gradientshapeok="t" o:connecttype="rect"/>
-              </v:shapetype>
-              <v:shape id="Text Box 1" o:spid="_x0000_s1026" type="#_x0000_t202" style="position:absolute;left:0;text-align:left;margin-left:-31.9pt;margin-top:180.2pt;width:384.6pt;height:249.5pt;z-index:251666432;visibility:visible;mso-wrap-style:square;mso-width-percent:0;mso-height-percent:0;mso-wrap-distance-left:9pt;mso-wrap-distance-top:0;mso-wrap-distance-right:9pt;mso-wrap-distance-bottom:0;mso-position-horizontal:absolute;mso-position-horizontal-relative:margin;mso-position-vertical:absolute;mso-position-vertical-relative:text;mso-width-percent:0;mso-height-percent:0;mso-width-relative:margin;mso-height-relative:margin;v-text-anchor:top" o:gfxdata="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" filled="f" stroked="f" strokeweight=".5pt">
+              <v:shape w14:anchorId="2D96A977" id="_x0000_s1027" type="#_x0000_t202" style="position:absolute;left:0;text-align:left;margin-left:-31.9pt;margin-top:180.2pt;width:384.6pt;height:249.5pt;z-index:251666432;visibility:visible;mso-wrap-style:square;mso-width-percent:0;mso-height-percent:0;mso-wrap-distance-left:9pt;mso-wrap-distance-top:0;mso-wrap-distance-right:9pt;mso-wrap-distance-bottom:0;mso-position-horizontal:absolute;mso-position-horizontal-relative:margin;mso-position-vertical:absolute;mso-position-vertical-relative:text;mso-width-percent:0;mso-height-percent:0;mso-width-relative:margin;mso-height-relative:margin;v-text-anchor:top" o:gfxdata="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" filled="f" stroked="f" strokeweight=".5pt">
                 <v:textbox>
                   <w:txbxContent>
                     <w:p>
@@ -287,7 +1033,7 @@
                           <w:szCs w:val="28"/>
                           <w14:ligatures w14:val="none"/>
                         </w:rPr>
-                        <w:t xml:space="preserve">for her outstanding efforts in her role as </w:t>
+                        <w:t>for her outstanding efforts in her role as</w:t>
                       </w:r>
                       <w:r>
                         <w:rPr>
@@ -298,7 +1044,7 @@
                           <w:szCs w:val="28"/>
                           <w14:ligatures w14:val="none"/>
                         </w:rPr>
-                        <w:t>Student Activities Committee</w:t>
+                        <w:t xml:space="preserve"> </w:t>
                       </w:r>
                       <w:r>
                         <w:rPr>
@@ -309,6 +1055,50 @@
                           <w:szCs w:val="28"/>
                           <w14:ligatures w14:val="none"/>
                         </w:rPr>
+                        <w:t>a member of</w:t>
+                      </w:r>
+                      <w:r>
+                        <w:rPr>
+                          <w:rFonts w:ascii="Frutiger LT Arabic 45 Light" w:eastAsia="Times New Roman" w:hAnsi="Frutiger LT Arabic 45 Light" w:cs="Frutiger LT Arabic 45 Light"/>
+                          <w:color w:val="002060"/>
+                          <w:kern w:val="0"/>
+                          <w:sz w:val="28"/>
+                          <w:szCs w:val="28"/>
+                          <w14:ligatures w14:val="none"/>
+                        </w:rPr>
+                        <w:t xml:space="preserve"> the</w:t>
+                      </w:r>
+                      <w:r>
+                        <w:rPr>
+                          <w:rFonts w:ascii="Frutiger LT Arabic 45 Light" w:eastAsia="Times New Roman" w:hAnsi="Frutiger LT Arabic 45 Light" w:cs="Frutiger LT Arabic 45 Light"/>
+                          <w:color w:val="002060"/>
+                          <w:kern w:val="0"/>
+                          <w:sz w:val="28"/>
+                          <w:szCs w:val="28"/>
+                          <w14:ligatures w14:val="none"/>
+                        </w:rPr>
+                        <w:t xml:space="preserve"> </w:t>
+                      </w:r>
+                      <w:r>
+                        <w:rPr>
+                          <w:rFonts w:ascii="Frutiger LT Arabic 45 Light" w:eastAsia="Times New Roman" w:hAnsi="Frutiger LT Arabic 45 Light" w:cs="Frutiger LT Arabic 45 Light"/>
+                          <w:color w:val="002060"/>
+                          <w:kern w:val="0"/>
+                          <w:sz w:val="28"/>
+                          <w:szCs w:val="28"/>
+                          <w14:ligatures w14:val="none"/>
+                        </w:rPr>
+                        <w:t>Student Activities Committee</w:t>
+                      </w:r>
+                      <w:r>
+                        <w:rPr>
+                          <w:rFonts w:ascii="Frutiger LT Arabic 45 Light" w:eastAsia="Times New Roman" w:hAnsi="Frutiger LT Arabic 45 Light" w:cs="Frutiger LT Arabic 45 Light"/>
+                          <w:color w:val="002060"/>
+                          <w:kern w:val="0"/>
+                          <w:sz w:val="28"/>
+                          <w:szCs w:val="28"/>
+                          <w14:ligatures w14:val="none"/>
+                        </w:rPr>
                         <w:t xml:space="preserve"> at the College of Computing and Informatics during the academic year 1447 AH</w:t>
                       </w:r>
                     </w:p>
@@ -334,712 +1124,6 @@
                           <w14:ligatures w14:val="none"/>
                         </w:rPr>
                         <w:t>Wishing her continued success and excellence.</w:t>
-                      </w:r>
-                    </w:p>
-                  </w:txbxContent>
-                </v:textbox>
-                <w10:wrap anchorx="margin"/>
-              </v:shape>
-            </w:pict>
-          </mc:Fallback>
-        </mc:AlternateContent>
-      </w:r>
-      <w:r>
-        <w:rPr>
-          <w:noProof/>
-        </w:rPr>
-        <mc:AlternateContent>
-          <mc:Choice Requires="wps">
-            <w:drawing>
-              <wp:anchor distT="0" distB="0" distL="114300" distR="114300" simplePos="0" relativeHeight="251664384" behindDoc="0" locked="0" layoutInCell="1" allowOverlap="1" wp14:anchorId="4BEF5500" wp14:editId="2F4B3104">
-                <wp:simplePos x="0" y="0"/>
-                <wp:positionH relativeFrom="margin">
-                  <wp:posOffset>4556125</wp:posOffset>
-                </wp:positionH>
-                <wp:positionV relativeFrom="paragraph">
-                  <wp:posOffset>2225361</wp:posOffset>
-                </wp:positionV>
-                <wp:extent cx="4744720" cy="3168650"/>
-                <wp:effectExtent l="0" t="0" r="0" b="0"/>
-                <wp:wrapNone/>
-                <wp:docPr id="1021757631" name="Text Box 1"/>
-                <wp:cNvGraphicFramePr/>
-                <a:graphic xmlns:a="http://schemas.openxmlformats.org/drawingml/2006/main">
-                  <a:graphicData uri="http://schemas.microsoft.com/office/word/2010/wordprocessingShape">
-                    <wps:wsp>
-                      <wps:cNvSpPr txBox="1"/>
-                      <wps:spPr>
-                        <a:xfrm>
-                          <a:off x="0" y="0"/>
-                          <a:ext cx="4744720" cy="3168650"/>
-                        </a:xfrm>
-                        <a:prstGeom prst="rect">
-                          <a:avLst/>
-                        </a:prstGeom>
-                        <a:noFill/>
-                        <a:ln w="6350">
-                          <a:noFill/>
-                        </a:ln>
-                      </wps:spPr>
-                      <wps:txbx>
-                        <w:txbxContent>
-                          <w:p>
-                            <w:pPr>
-                              <w:spacing w:after="0" w:line="240" w:lineRule="auto"/>
-                              <w:jc w:val="center"/>
-                              <w:rPr>
-                                <w:rFonts w:ascii="Frutiger LT Arabic 45 Light" w:eastAsia="Times New Roman" w:hAnsi="Frutiger LT Arabic 45 Light" w:cs="Frutiger LT Arabic 45 Light"/>
-                                <w:color w:val="156082" w:themeColor="accent1"/>
-                                <w:kern w:val="0"/>
-                                <w:sz w:val="28"/>
-                                <w:szCs w:val="28"/>
-                                <w:rtl/>
-                                <w14:ligatures w14:val="none"/>
-                              </w:rPr>
-                            </w:pPr>
-                            <w:r>
-                              <w:rPr>
-                                <w:rFonts w:ascii="Frutiger LT Arabic 45 Light" w:eastAsia="Times New Roman" w:hAnsi="Frutiger LT Arabic 45 Light" w:cs="Frutiger LT Arabic 45 Light" w:hint="cs"/>
-                                <w:color w:val="156082" w:themeColor="accent1"/>
-                                <w:kern w:val="0"/>
-                                <w:sz w:val="28"/>
-                                <w:szCs w:val="28"/>
-                                <w:rtl/>
-                                <w14:ligatures w14:val="none"/>
-                              </w:rPr>
-                              <w:t>يسر كلية الحوسبة والمعلوماتية بالجامعة السعودية ال</w:t>
-                            </w:r>
-                            <w:r>
-                              <w:rPr>
-                                <w:rFonts w:ascii="Frutiger LT Arabic 45 Light" w:eastAsia="Times New Roman" w:hAnsi="Frutiger LT Arabic 45 Light" w:cs="Frutiger LT Arabic 45 Light" w:hint="cs"/>
-                                <w:color w:val="156082" w:themeColor="accent1"/>
-                                <w:kern w:val="0"/>
-                                <w:sz w:val="28"/>
-                                <w:szCs w:val="28"/>
-                                <w:rtl/>
-                                <w14:ligatures w14:val="none"/>
-                              </w:rPr>
-                              <w:t>إ</w:t>
-                            </w:r>
-                            <w:r>
-                              <w:rPr>
-                                <w:rFonts w:ascii="Frutiger LT Arabic 45 Light" w:eastAsia="Times New Roman" w:hAnsi="Frutiger LT Arabic 45 Light" w:cs="Frutiger LT Arabic 45 Light" w:hint="cs"/>
-                                <w:color w:val="156082" w:themeColor="accent1"/>
-                                <w:kern w:val="0"/>
-                                <w:sz w:val="28"/>
-                                <w:szCs w:val="28"/>
-                                <w:rtl/>
-                                <w14:ligatures w14:val="none"/>
-                              </w:rPr>
-                              <w:t>لكترونية</w:t>
-                            </w:r>
-                          </w:p>
-                          <w:p>
-                            <w:pPr>
-                              <w:spacing w:after="0" w:line="240" w:lineRule="auto"/>
-                              <w:jc w:val="center"/>
-                              <w:rPr>
-                                <w:rFonts w:ascii="Frutiger LT Arabic 45 Light" w:eastAsia="Times New Roman" w:hAnsi="Frutiger LT Arabic 45 Light" w:cs="Frutiger LT Arabic 45 Light"/>
-                                <w:color w:val="156082" w:themeColor="accent1"/>
-                                <w:kern w:val="0"/>
-                                <w:sz w:val="28"/>
-                                <w:szCs w:val="28"/>
-                                <w:rtl/>
-                                <w14:ligatures w14:val="none"/>
-                              </w:rPr>
-                            </w:pPr>
-                            <w:r>
-                              <w:rPr>
-                                <w:rFonts w:ascii="Frutiger LT Arabic 45 Light" w:eastAsia="Times New Roman" w:hAnsi="Frutiger LT Arabic 45 Light" w:cs="Frutiger LT Arabic 45 Light" w:hint="cs"/>
-                                <w:color w:val="156082" w:themeColor="accent1"/>
-                                <w:kern w:val="0"/>
-                                <w:sz w:val="28"/>
-                                <w:szCs w:val="28"/>
-                                <w:rtl/>
-                                <w14:ligatures w14:val="none"/>
-                              </w:rPr>
-                              <w:t>أن تتقدم بوافر الشكر والتقدير</w:t>
-                            </w:r>
-                          </w:p>
-                          <w:p>
-                            <w:pPr>
-                              <w:bidi/>
-                              <w:spacing w:after="0" w:line="240" w:lineRule="auto"/>
-                              <w:jc w:val="center"/>
-                              <w:rPr>
-                                <w:rFonts w:ascii="Frutiger LT Arabic 45 Light" w:eastAsia="Times New Roman" w:hAnsi="Frutiger LT Arabic 45 Light" w:cs="Frutiger LT Arabic 45 Light"/>
-                                <w:color w:val="156082" w:themeColor="accent1"/>
-                                <w:kern w:val="0"/>
-                                <w:sz w:val="28"/>
-                                <w:szCs w:val="28"/>
-                                <w14:ligatures w14:val="none"/>
-                              </w:rPr>
-                            </w:pPr>
-                            <w:r>
-                              <w:rPr>
-                                <w:rFonts w:ascii="Frutiger LT Arabic 45 Light" w:eastAsia="Times New Roman" w:hAnsi="Frutiger LT Arabic 45 Light" w:cs="Frutiger LT Arabic 45 Light"/>
-                                <w:color w:val="156082" w:themeColor="accent1"/>
-                                <w:kern w:val="0"/>
-                                <w:sz w:val="28"/>
-                                <w:szCs w:val="28"/>
-                                <w14:ligatures w14:val="none"/>
-                              </w:rPr>
-                              <w:t>للمحاضرة</w:t>
-                            </w:r>
-                            <w:r>
-                              <w:rPr>
-                                <w:rFonts w:ascii="Frutiger LT Arabic 45 Light" w:eastAsia="Times New Roman" w:hAnsi="Frutiger LT Arabic 45 Light" w:cs="Frutiger LT Arabic 45 Light" w:hint="cs"/>
-                                <w:color w:val="156082" w:themeColor="accent1"/>
-                                <w:kern w:val="0"/>
-                                <w:sz w:val="28"/>
-                                <w:szCs w:val="28"/>
-                                <w:rtl/>
-                                <w14:ligatures w14:val="none"/>
-                              </w:rPr>
-                              <w:t>/</w:t>
-                            </w:r>
-                            <w:r>
-                              <w:rPr>
-                                <w:rFonts w:ascii="Frutiger LT Arabic 45 Light" w:eastAsia="Times New Roman" w:hAnsi="Frutiger LT Arabic 45 Light" w:cs="Frutiger LT Arabic 45 Light" w:hint="cs"/>
-                                <w:color w:val="156082" w:themeColor="accent1"/>
-                                <w:kern w:val="0"/>
-                                <w:sz w:val="28"/>
-                                <w:szCs w:val="28"/>
-                                <w:rtl/>
-                                <w14:ligatures w14:val="none"/>
-                              </w:rPr>
-                              <w:t xml:space="preserve"> </w:t>
-                            </w:r>
-                            <w:r>
-                              <w:rPr>
-                                <w:rFonts w:ascii="Frutiger LT Arabic 45 Light" w:eastAsia="Times New Roman" w:hAnsi="Frutiger LT Arabic 45 Light" w:cs="Frutiger LT Arabic 45 Light"/>
-                                <w:color w:val="156082" w:themeColor="accent1"/>
-                                <w:kern w:val="0"/>
-                                <w:sz w:val="28"/>
-                                <w:szCs w:val="28"/>
-                                <w14:ligatures w14:val="none"/>
-                              </w:rPr>
-                              <w:t>إيمان بنت علي البدر</w:t>
-                            </w:r>
-                            <w:r>
-                              <w:rPr>
-                                <w:rFonts w:ascii="Frutiger LT Arabic 45 Light" w:eastAsia="Times New Roman" w:hAnsi="Frutiger LT Arabic 45 Light" w:cs="Frutiger LT Arabic 45 Light"/>
-                                <w:color w:val="156082" w:themeColor="accent1"/>
-                                <w:kern w:val="0"/>
-                                <w:sz w:val="28"/>
-                                <w:szCs w:val="28"/>
-                                <w14:ligatures w14:val="none"/>
-                              </w:rPr>
-                              <w:t xml:space="preserve"> </w:t>
-                            </w:r>
-                          </w:p>
-                          <w:p>
-                            <w:pPr>
-                              <w:bidi/>
-                              <w:spacing w:after="0" w:line="240" w:lineRule="auto"/>
-                              <w:jc w:val="center"/>
-                              <w:rPr>
-                                <w:rFonts w:ascii="Frutiger LT Arabic 45 Light" w:eastAsia="Times New Roman" w:hAnsi="Frutiger LT Arabic 45 Light" w:cs="Frutiger LT Arabic 45 Light"/>
-                                <w:color w:val="156082" w:themeColor="accent1"/>
-                                <w:kern w:val="0"/>
-                                <w:sz w:val="28"/>
-                                <w:szCs w:val="28"/>
-                                <w:rtl/>
-                                <w14:ligatures w14:val="none"/>
-                              </w:rPr>
-                            </w:pPr>
-                            <w:r>
-                              <w:rPr>
-                                <w:rFonts w:ascii="Frutiger LT Arabic 45 Light" w:eastAsia="Times New Roman" w:hAnsi="Frutiger LT Arabic 45 Light" w:cs="Frutiger LT Arabic 45 Light" w:hint="cs"/>
-                                <w:color w:val="156082" w:themeColor="accent1"/>
-                                <w:kern w:val="0"/>
-                                <w:sz w:val="28"/>
-                                <w:szCs w:val="28"/>
-                                <w:rtl/>
-                                <w14:ligatures w14:val="none"/>
-                              </w:rPr>
-                              <w:t>على جهودها المميزة في عملها</w:t>
-                            </w:r>
-                            <w:r>
-                              <w:rPr>
-                                <w:rFonts w:ascii="Frutiger LT Arabic 45 Light" w:eastAsia="Times New Roman" w:hAnsi="Frutiger LT Arabic 45 Light" w:cs="Frutiger LT Arabic 45 Light" w:hint="cs"/>
-                                <w:color w:val="156082" w:themeColor="accent1"/>
-                                <w:kern w:val="0"/>
-                                <w:sz w:val="28"/>
-                                <w:szCs w:val="28"/>
-                                <w:rtl/>
-                                <w14:ligatures w14:val="none"/>
-                              </w:rPr>
-                              <w:t xml:space="preserve"> </w:t>
-                            </w:r>
-                            <w:r>
-                              <w:rPr>
-                                <w:rFonts w:ascii="Frutiger LT Arabic 45 Light" w:eastAsia="Times New Roman" w:hAnsi="Frutiger LT Arabic 45 Light" w:cs="Frutiger LT Arabic 45 Light"/>
-                                <w:color w:val="156082" w:themeColor="accent1"/>
-                                <w:kern w:val="0"/>
-                                <w:sz w:val="28"/>
-                                <w:szCs w:val="28"/>
-                                <w14:ligatures w14:val="none"/>
-                              </w:rPr>
-                              <w:t>كلجنة  الأنشطة الطلابية</w:t>
-                            </w:r>
-                            <w:r>
-                              <w:rPr>
-                                <w:rFonts w:ascii="Frutiger LT Arabic 45 Light" w:eastAsia="Times New Roman" w:hAnsi="Frutiger LT Arabic 45 Light" w:cs="Frutiger LT Arabic 45 Light" w:hint="cs"/>
-                                <w:color w:val="156082" w:themeColor="accent1"/>
-                                <w:kern w:val="0"/>
-                                <w:sz w:val="28"/>
-                                <w:szCs w:val="28"/>
-                                <w:rtl/>
-                                <w14:ligatures w14:val="none"/>
-                              </w:rPr>
-                              <w:t xml:space="preserve"> </w:t>
-                            </w:r>
-                            <w:r>
-                              <w:rPr>
-                                <w:rFonts w:ascii="Frutiger LT Arabic 45 Light" w:eastAsia="Times New Roman" w:hAnsi="Frutiger LT Arabic 45 Light" w:cs="Frutiger LT Arabic 45 Light" w:hint="cs"/>
-                                <w:color w:val="156082" w:themeColor="accent1"/>
-                                <w:kern w:val="0"/>
-                                <w:sz w:val="28"/>
-                                <w:szCs w:val="28"/>
-                                <w:rtl/>
-                                <w14:ligatures w14:val="none"/>
-                              </w:rPr>
-                              <w:t>ب</w:t>
-                            </w:r>
-                            <w:r>
-                              <w:rPr>
-                                <w:rFonts w:ascii="Frutiger LT Arabic 45 Light" w:eastAsia="Times New Roman" w:hAnsi="Frutiger LT Arabic 45 Light" w:cs="Frutiger LT Arabic 45 Light" w:hint="cs"/>
-                                <w:color w:val="156082" w:themeColor="accent1"/>
-                                <w:kern w:val="0"/>
-                                <w:sz w:val="28"/>
-                                <w:szCs w:val="28"/>
-                                <w:rtl/>
-                                <w14:ligatures w14:val="none"/>
-                              </w:rPr>
-                              <w:t>كلية الحوسبة</w:t>
-                            </w:r>
-                            <w:r>
-                              <w:rPr>
-                                <w:rFonts w:ascii="Frutiger LT Arabic 45 Light" w:eastAsia="Times New Roman" w:hAnsi="Frutiger LT Arabic 45 Light" w:cs="Frutiger LT Arabic 45 Light" w:hint="cs"/>
-                                <w:color w:val="156082" w:themeColor="accent1"/>
-                                <w:kern w:val="0"/>
-                                <w:sz w:val="28"/>
-                                <w:szCs w:val="28"/>
-                                <w:rtl/>
-                                <w14:ligatures w14:val="none"/>
-                              </w:rPr>
-                              <w:t xml:space="preserve"> </w:t>
-                            </w:r>
-                            <w:r>
-                              <w:rPr>
-                                <w:rFonts w:ascii="Frutiger LT Arabic 45 Light" w:eastAsia="Times New Roman" w:hAnsi="Frutiger LT Arabic 45 Light" w:cs="Frutiger LT Arabic 45 Light" w:hint="cs"/>
-                                <w:color w:val="156082" w:themeColor="accent1"/>
-                                <w:kern w:val="0"/>
-                                <w:sz w:val="28"/>
-                                <w:szCs w:val="28"/>
-                                <w:rtl/>
-                                <w14:ligatures w14:val="none"/>
-                              </w:rPr>
-                              <w:t xml:space="preserve">والمعلوماتية </w:t>
-                            </w:r>
-                            <w:r>
-                              <w:rPr>
-                                <w:rFonts w:ascii="Frutiger LT Arabic 45 Light" w:eastAsia="Times New Roman" w:hAnsi="Frutiger LT Arabic 45 Light" w:cs="Frutiger LT Arabic 45 Light" w:hint="cs"/>
-                                <w:color w:val="156082" w:themeColor="accent1"/>
-                                <w:kern w:val="0"/>
-                                <w:sz w:val="28"/>
-                                <w:szCs w:val="28"/>
-                                <w:rtl/>
-                                <w14:ligatures w14:val="none"/>
-                              </w:rPr>
-                              <w:t>خلال العام الجامعي ١٤٤٧ هـ</w:t>
-                            </w:r>
-                          </w:p>
-                          <w:p>
-                            <w:pPr>
-                              <w:bidi/>
-                              <w:spacing w:after="0" w:line="240" w:lineRule="auto"/>
-                              <w:jc w:val="center"/>
-                              <w:rPr>
-                                <w:rFonts w:ascii="Frutiger LT Arabic 45 Light" w:eastAsia="Times New Roman" w:hAnsi="Frutiger LT Arabic 45 Light" w:cs="Frutiger LT Arabic 45 Light"/>
-                                <w:color w:val="156082" w:themeColor="accent1"/>
-                                <w:kern w:val="0"/>
-                                <w:sz w:val="28"/>
-                                <w:szCs w:val="28"/>
-                                <w14:ligatures w14:val="none"/>
-                              </w:rPr>
-                            </w:pPr>
-                          </w:p>
-                          <w:p>
-                            <w:pPr>
-                              <w:bidi/>
-                              <w:spacing w:after="0" w:line="240" w:lineRule="auto"/>
-                              <w:jc w:val="center"/>
-                              <w:rPr>
-                                <w:rFonts w:ascii="Frutiger LT Arabic 45 Light" w:eastAsia="Times New Roman" w:hAnsi="Frutiger LT Arabic 45 Light" w:cs="Frutiger LT Arabic 45 Light"/>
-                                <w:color w:val="156082" w:themeColor="accent1"/>
-                                <w:kern w:val="0"/>
-                                <w:sz w:val="28"/>
-                                <w:szCs w:val="28"/>
-                                <w14:ligatures w14:val="none"/>
-                              </w:rPr>
-                            </w:pPr>
-                            <w:r>
-                              <w:rPr>
-                                <w:rFonts w:ascii="Frutiger LT Arabic 45 Light" w:eastAsia="Times New Roman" w:hAnsi="Frutiger LT Arabic 45 Light" w:cs="Frutiger LT Arabic 45 Light" w:hint="cs"/>
-                                <w:color w:val="156082" w:themeColor="accent1"/>
-                                <w:kern w:val="0"/>
-                                <w:sz w:val="28"/>
-                                <w:szCs w:val="28"/>
-                                <w:rtl/>
-                                <w14:ligatures w14:val="none"/>
-                              </w:rPr>
-                              <w:t>سائلين المولى لها مزِيدًا من النجاح والتقدم</w:t>
-                            </w:r>
-                          </w:p>
-                        </w:txbxContent>
-                      </wps:txbx>
-                      <wps:bodyPr rot="0" spcFirstLastPara="0" vertOverflow="overflow" horzOverflow="overflow" vert="horz" wrap="square" lIns="91440" tIns="45720" rIns="91440" bIns="45720" numCol="1" spcCol="0" rtlCol="1" fromWordArt="0" anchor="t" anchorCtr="0" forceAA="0" compatLnSpc="1">
-                        <a:prstTxWarp prst="textNoShape">
-                          <a:avLst/>
-                        </a:prstTxWarp>
-                        <a:noAutofit/>
-                      </wps:bodyPr>
-                    </wps:wsp>
-                  </a:graphicData>
-                </a:graphic>
-                <wp14:sizeRelH relativeFrom="margin">
-                  <wp14:pctWidth>0</wp14:pctWidth>
-                </wp14:sizeRelH>
-                <wp14:sizeRelV relativeFrom="margin">
-                  <wp14:pctHeight>0</wp14:pctHeight>
-                </wp14:sizeRelV>
-              </wp:anchor>
-            </w:drawing>
-          </mc:Choice>
-          <mc:Fallback>
-            <w:pict>
-              <v:shapetype w14:anchorId="4BEF5500" id="_x0000_t202" coordsize="21600,21600" o:spt="202" path="m,l,21600r21600,l21600,xe">
-                <v:stroke joinstyle="miter"/>
-                <v:path gradientshapeok="t" o:connecttype="rect"/>
-              </v:shapetype>
-              <v:shape id="_x0000_s1027" type="#_x0000_t202" style="position:absolute;left:0;text-align:left;margin-left:358.75pt;margin-top:175.25pt;width:373.6pt;height:249.5pt;z-index:251664384;visibility:visible;mso-wrap-style:square;mso-width-percent:0;mso-height-percent:0;mso-wrap-distance-left:9pt;mso-wrap-distance-top:0;mso-wrap-distance-right:9pt;mso-wrap-distance-bottom:0;mso-position-horizontal:absolute;mso-position-horizontal-relative:margin;mso-position-vertical:absolute;mso-position-vertical-relative:text;mso-width-percent:0;mso-height-percent:0;mso-width-relative:margin;mso-height-relative:margin;v-text-anchor:top" o:gfxdata="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" filled="f" stroked="f" strokeweight=".5pt">
-                <v:textbox>
-                  <w:txbxContent>
-                    <w:p>
-                      <w:pPr>
-                        <w:spacing w:after="0" w:line="240" w:lineRule="auto"/>
-                        <w:jc w:val="center"/>
-                        <w:rPr>
-                          <w:rFonts w:ascii="Frutiger LT Arabic 45 Light" w:eastAsia="Times New Roman" w:hAnsi="Frutiger LT Arabic 45 Light" w:cs="Frutiger LT Arabic 45 Light"/>
-                          <w:color w:val="156082" w:themeColor="accent1"/>
-                          <w:kern w:val="0"/>
-                          <w:sz w:val="28"/>
-                          <w:szCs w:val="28"/>
-                          <w:rtl/>
-                          <w14:ligatures w14:val="none"/>
-                        </w:rPr>
-                      </w:pPr>
-                      <w:r>
-                        <w:rPr>
-                          <w:rFonts w:ascii="Frutiger LT Arabic 45 Light" w:eastAsia="Times New Roman" w:hAnsi="Frutiger LT Arabic 45 Light" w:cs="Frutiger LT Arabic 45 Light" w:hint="cs"/>
-                          <w:color w:val="156082" w:themeColor="accent1"/>
-                          <w:kern w:val="0"/>
-                          <w:sz w:val="28"/>
-                          <w:szCs w:val="28"/>
-                          <w:rtl/>
-                          <w14:ligatures w14:val="none"/>
-                        </w:rPr>
-                        <w:t>يسر كلية الحوسبة والمعلوماتية بالجامعة السعودية ال</w:t>
-                      </w:r>
-                      <w:r>
-                        <w:rPr>
-                          <w:rFonts w:ascii="Frutiger LT Arabic 45 Light" w:eastAsia="Times New Roman" w:hAnsi="Frutiger LT Arabic 45 Light" w:cs="Frutiger LT Arabic 45 Light" w:hint="cs"/>
-                          <w:color w:val="156082" w:themeColor="accent1"/>
-                          <w:kern w:val="0"/>
-                          <w:sz w:val="28"/>
-                          <w:szCs w:val="28"/>
-                          <w:rtl/>
-                          <w14:ligatures w14:val="none"/>
-                        </w:rPr>
-                        <w:t>إ</w:t>
-                      </w:r>
-                      <w:r>
-                        <w:rPr>
-                          <w:rFonts w:ascii="Frutiger LT Arabic 45 Light" w:eastAsia="Times New Roman" w:hAnsi="Frutiger LT Arabic 45 Light" w:cs="Frutiger LT Arabic 45 Light" w:hint="cs"/>
-                          <w:color w:val="156082" w:themeColor="accent1"/>
-                          <w:kern w:val="0"/>
-                          <w:sz w:val="28"/>
-                          <w:szCs w:val="28"/>
-                          <w:rtl/>
-                          <w14:ligatures w14:val="none"/>
-                        </w:rPr>
-                        <w:t>لكترونية</w:t>
-                      </w:r>
-                    </w:p>
-                    <w:p>
-                      <w:pPr>
-                        <w:spacing w:after="0" w:line="240" w:lineRule="auto"/>
-                        <w:jc w:val="center"/>
-                        <w:rPr>
-                          <w:rFonts w:ascii="Frutiger LT Arabic 45 Light" w:eastAsia="Times New Roman" w:hAnsi="Frutiger LT Arabic 45 Light" w:cs="Frutiger LT Arabic 45 Light"/>
-                          <w:color w:val="156082" w:themeColor="accent1"/>
-                          <w:kern w:val="0"/>
-                          <w:sz w:val="28"/>
-                          <w:szCs w:val="28"/>
-                          <w:rtl/>
-                          <w14:ligatures w14:val="none"/>
-                        </w:rPr>
-                      </w:pPr>
-                      <w:r>
-                        <w:rPr>
-                          <w:rFonts w:ascii="Frutiger LT Arabic 45 Light" w:eastAsia="Times New Roman" w:hAnsi="Frutiger LT Arabic 45 Light" w:cs="Frutiger LT Arabic 45 Light" w:hint="cs"/>
-                          <w:color w:val="156082" w:themeColor="accent1"/>
-                          <w:kern w:val="0"/>
-                          <w:sz w:val="28"/>
-                          <w:szCs w:val="28"/>
-                          <w:rtl/>
-                          <w14:ligatures w14:val="none"/>
-                        </w:rPr>
-                        <w:t>أن تتقدم بوافر الشكر والتقدير</w:t>
-                      </w:r>
-                    </w:p>
-                    <w:p>
-                      <w:pPr>
-                        <w:bidi/>
-                        <w:spacing w:after="0" w:line="240" w:lineRule="auto"/>
-                        <w:jc w:val="center"/>
-                        <w:rPr>
-                          <w:rFonts w:ascii="Frutiger LT Arabic 45 Light" w:eastAsia="Times New Roman" w:hAnsi="Frutiger LT Arabic 45 Light" w:cs="Frutiger LT Arabic 45 Light"/>
-                          <w:color w:val="156082" w:themeColor="accent1"/>
-                          <w:kern w:val="0"/>
-                          <w:sz w:val="28"/>
-                          <w:szCs w:val="28"/>
-                          <w14:ligatures w14:val="none"/>
-                        </w:rPr>
-                      </w:pPr>
-                      <w:r>
-                        <w:rPr>
-                          <w:rFonts w:ascii="Frutiger LT Arabic 45 Light" w:eastAsia="Times New Roman" w:hAnsi="Frutiger LT Arabic 45 Light" w:cs="Frutiger LT Arabic 45 Light"/>
-                          <w:color w:val="156082" w:themeColor="accent1"/>
-                          <w:kern w:val="0"/>
-                          <w:sz w:val="28"/>
-                          <w:szCs w:val="28"/>
-                          <w14:ligatures w14:val="none"/>
-                        </w:rPr>
-                        <w:t>للمحاضرة</w:t>
-                      </w:r>
-                      <w:r>
-                        <w:rPr>
-                          <w:rFonts w:ascii="Frutiger LT Arabic 45 Light" w:eastAsia="Times New Roman" w:hAnsi="Frutiger LT Arabic 45 Light" w:cs="Frutiger LT Arabic 45 Light" w:hint="cs"/>
-                          <w:color w:val="156082" w:themeColor="accent1"/>
-                          <w:kern w:val="0"/>
-                          <w:sz w:val="28"/>
-                          <w:szCs w:val="28"/>
-                          <w:rtl/>
-                          <w14:ligatures w14:val="none"/>
-                        </w:rPr>
-                        <w:t>/</w:t>
-                      </w:r>
-                      <w:r>
-                        <w:rPr>
-                          <w:rFonts w:ascii="Frutiger LT Arabic 45 Light" w:eastAsia="Times New Roman" w:hAnsi="Frutiger LT Arabic 45 Light" w:cs="Frutiger LT Arabic 45 Light" w:hint="cs"/>
-                          <w:color w:val="156082" w:themeColor="accent1"/>
-                          <w:kern w:val="0"/>
-                          <w:sz w:val="28"/>
-                          <w:szCs w:val="28"/>
-                          <w:rtl/>
-                          <w14:ligatures w14:val="none"/>
-                        </w:rPr>
-                        <w:t xml:space="preserve"> </w:t>
-                      </w:r>
-                      <w:r>
-                        <w:rPr>
-                          <w:rFonts w:ascii="Frutiger LT Arabic 45 Light" w:eastAsia="Times New Roman" w:hAnsi="Frutiger LT Arabic 45 Light" w:cs="Frutiger LT Arabic 45 Light"/>
-                          <w:color w:val="156082" w:themeColor="accent1"/>
-                          <w:kern w:val="0"/>
-                          <w:sz w:val="28"/>
-                          <w:szCs w:val="28"/>
-                          <w14:ligatures w14:val="none"/>
-                        </w:rPr>
-                        <w:t>إيمان بنت علي البدر</w:t>
-                      </w:r>
-                      <w:r>
-                        <w:rPr>
-                          <w:rFonts w:ascii="Frutiger LT Arabic 45 Light" w:eastAsia="Times New Roman" w:hAnsi="Frutiger LT Arabic 45 Light" w:cs="Frutiger LT Arabic 45 Light"/>
-                          <w:color w:val="156082" w:themeColor="accent1"/>
-                          <w:kern w:val="0"/>
-                          <w:sz w:val="28"/>
-                          <w:szCs w:val="28"/>
-                          <w14:ligatures w14:val="none"/>
-                        </w:rPr>
-                        <w:t xml:space="preserve"> </w:t>
-                      </w:r>
-                    </w:p>
-                    <w:p>
-                      <w:pPr>
-                        <w:bidi/>
-                        <w:spacing w:after="0" w:line="240" w:lineRule="auto"/>
-                        <w:jc w:val="center"/>
-                        <w:rPr>
-                          <w:rFonts w:ascii="Frutiger LT Arabic 45 Light" w:eastAsia="Times New Roman" w:hAnsi="Frutiger LT Arabic 45 Light" w:cs="Frutiger LT Arabic 45 Light"/>
-                          <w:color w:val="156082" w:themeColor="accent1"/>
-                          <w:kern w:val="0"/>
-                          <w:sz w:val="28"/>
-                          <w:szCs w:val="28"/>
-                          <w:rtl/>
-                          <w14:ligatures w14:val="none"/>
-                        </w:rPr>
-                      </w:pPr>
-                      <w:r>
-                        <w:rPr>
-                          <w:rFonts w:ascii="Frutiger LT Arabic 45 Light" w:eastAsia="Times New Roman" w:hAnsi="Frutiger LT Arabic 45 Light" w:cs="Frutiger LT Arabic 45 Light" w:hint="cs"/>
-                          <w:color w:val="156082" w:themeColor="accent1"/>
-                          <w:kern w:val="0"/>
-                          <w:sz w:val="28"/>
-                          <w:szCs w:val="28"/>
-                          <w:rtl/>
-                          <w14:ligatures w14:val="none"/>
-                        </w:rPr>
-                        <w:t>على جهودها المميزة في عملها</w:t>
-                      </w:r>
-                      <w:r>
-                        <w:rPr>
-                          <w:rFonts w:ascii="Frutiger LT Arabic 45 Light" w:eastAsia="Times New Roman" w:hAnsi="Frutiger LT Arabic 45 Light" w:cs="Frutiger LT Arabic 45 Light" w:hint="cs"/>
-                          <w:color w:val="156082" w:themeColor="accent1"/>
-                          <w:kern w:val="0"/>
-                          <w:sz w:val="28"/>
-                          <w:szCs w:val="28"/>
-                          <w:rtl/>
-                          <w14:ligatures w14:val="none"/>
-                        </w:rPr>
-                        <w:t xml:space="preserve"> </w:t>
-                      </w:r>
-                      <w:r>
-                        <w:rPr>
-                          <w:rFonts w:ascii="Frutiger LT Arabic 45 Light" w:eastAsia="Times New Roman" w:hAnsi="Frutiger LT Arabic 45 Light" w:cs="Frutiger LT Arabic 45 Light"/>
-                          <w:color w:val="156082" w:themeColor="accent1"/>
-                          <w:kern w:val="0"/>
-                          <w:sz w:val="28"/>
-                          <w:szCs w:val="28"/>
-                          <w14:ligatures w14:val="none"/>
-                        </w:rPr>
-                        <w:t>كلجنة  الأنشطة الطلابية</w:t>
-                      </w:r>
-                      <w:r>
-                        <w:rPr>
-                          <w:rFonts w:ascii="Frutiger LT Arabic 45 Light" w:eastAsia="Times New Roman" w:hAnsi="Frutiger LT Arabic 45 Light" w:cs="Frutiger LT Arabic 45 Light" w:hint="cs"/>
-                          <w:color w:val="156082" w:themeColor="accent1"/>
-                          <w:kern w:val="0"/>
-                          <w:sz w:val="28"/>
-                          <w:szCs w:val="28"/>
-                          <w:rtl/>
-                          <w14:ligatures w14:val="none"/>
-                        </w:rPr>
-                        <w:t xml:space="preserve"> </w:t>
-                      </w:r>
-                      <w:r>
-                        <w:rPr>
-                          <w:rFonts w:ascii="Frutiger LT Arabic 45 Light" w:eastAsia="Times New Roman" w:hAnsi="Frutiger LT Arabic 45 Light" w:cs="Frutiger LT Arabic 45 Light" w:hint="cs"/>
-                          <w:color w:val="156082" w:themeColor="accent1"/>
-                          <w:kern w:val="0"/>
-                          <w:sz w:val="28"/>
-                          <w:szCs w:val="28"/>
-                          <w:rtl/>
-                          <w14:ligatures w14:val="none"/>
-                        </w:rPr>
-                        <w:t>ب</w:t>
-                      </w:r>
-                      <w:r>
-                        <w:rPr>
-                          <w:rFonts w:ascii="Frutiger LT Arabic 45 Light" w:eastAsia="Times New Roman" w:hAnsi="Frutiger LT Arabic 45 Light" w:cs="Frutiger LT Arabic 45 Light" w:hint="cs"/>
-                          <w:color w:val="156082" w:themeColor="accent1"/>
-                          <w:kern w:val="0"/>
-                          <w:sz w:val="28"/>
-                          <w:szCs w:val="28"/>
-                          <w:rtl/>
-                          <w14:ligatures w14:val="none"/>
-                        </w:rPr>
-                        <w:t>كلية الحوسبة</w:t>
-                      </w:r>
-                      <w:r>
-                        <w:rPr>
-                          <w:rFonts w:ascii="Frutiger LT Arabic 45 Light" w:eastAsia="Times New Roman" w:hAnsi="Frutiger LT Arabic 45 Light" w:cs="Frutiger LT Arabic 45 Light" w:hint="cs"/>
-                          <w:color w:val="156082" w:themeColor="accent1"/>
-                          <w:kern w:val="0"/>
-                          <w:sz w:val="28"/>
-                          <w:szCs w:val="28"/>
-                          <w:rtl/>
-                          <w14:ligatures w14:val="none"/>
-                        </w:rPr>
-                        <w:t xml:space="preserve"> </w:t>
-                      </w:r>
-                      <w:r>
-                        <w:rPr>
-                          <w:rFonts w:ascii="Frutiger LT Arabic 45 Light" w:eastAsia="Times New Roman" w:hAnsi="Frutiger LT Arabic 45 Light" w:cs="Frutiger LT Arabic 45 Light" w:hint="cs"/>
-                          <w:color w:val="156082" w:themeColor="accent1"/>
-                          <w:kern w:val="0"/>
-                          <w:sz w:val="28"/>
-                          <w:szCs w:val="28"/>
-                          <w:rtl/>
-                          <w14:ligatures w14:val="none"/>
-                        </w:rPr>
-                        <w:t xml:space="preserve">والمعلوماتية </w:t>
-                      </w:r>
-                      <w:r>
-                        <w:rPr>
-                          <w:rFonts w:ascii="Frutiger LT Arabic 45 Light" w:eastAsia="Times New Roman" w:hAnsi="Frutiger LT Arabic 45 Light" w:cs="Frutiger LT Arabic 45 Light" w:hint="cs"/>
-                          <w:color w:val="156082" w:themeColor="accent1"/>
-                          <w:kern w:val="0"/>
-                          <w:sz w:val="28"/>
-                          <w:szCs w:val="28"/>
-                          <w:rtl/>
-                          <w14:ligatures w14:val="none"/>
-                        </w:rPr>
-                        <w:t>خلال العام الجامعي ١٤٤٧ هـ</w:t>
-                      </w:r>
-                    </w:p>
-                    <w:p>
-                      <w:pPr>
-                        <w:bidi/>
-                        <w:spacing w:after="0" w:line="240" w:lineRule="auto"/>
-                        <w:jc w:val="center"/>
-                        <w:rPr>
-                          <w:rFonts w:ascii="Frutiger LT Arabic 45 Light" w:eastAsia="Times New Roman" w:hAnsi="Frutiger LT Arabic 45 Light" w:cs="Frutiger LT Arabic 45 Light"/>
-                          <w:color w:val="156082" w:themeColor="accent1"/>
-                          <w:kern w:val="0"/>
-                          <w:sz w:val="28"/>
-                          <w:szCs w:val="28"/>
-                          <w14:ligatures w14:val="none"/>
-                        </w:rPr>
-                      </w:pPr>
-                    </w:p>
-                    <w:p>
-                      <w:pPr>
-                        <w:bidi/>
-                        <w:spacing w:after="0" w:line="240" w:lineRule="auto"/>
-                        <w:jc w:val="center"/>
-                        <w:rPr>
-                          <w:rFonts w:ascii="Frutiger LT Arabic 45 Light" w:eastAsia="Times New Roman" w:hAnsi="Frutiger LT Arabic 45 Light" w:cs="Frutiger LT Arabic 45 Light"/>
-                          <w:color w:val="156082" w:themeColor="accent1"/>
-                          <w:kern w:val="0"/>
-                          <w:sz w:val="28"/>
-                          <w:szCs w:val="28"/>
-                          <w14:ligatures w14:val="none"/>
-                        </w:rPr>
-                      </w:pPr>
-                      <w:r>
-                        <w:rPr>
-                          <w:rFonts w:ascii="Frutiger LT Arabic 45 Light" w:eastAsia="Times New Roman" w:hAnsi="Frutiger LT Arabic 45 Light" w:cs="Frutiger LT Arabic 45 Light" w:hint="cs"/>
-                          <w:color w:val="156082" w:themeColor="accent1"/>
-                          <w:kern w:val="0"/>
-                          <w:sz w:val="28"/>
-                          <w:szCs w:val="28"/>
-                          <w:rtl/>
-                          <w14:ligatures w14:val="none"/>
-                        </w:rPr>
-                        <w:t>سائلين المولى لها مزِيدًا من النجاح والتقدم</w:t>
                       </w:r>
                     </w:p>
                   </w:txbxContent>

</xml_diff>

<commit_message>
Fix extra spaces in Arabic roles and normalize whitespace
https://claude.ai/code/session_01XbHfH1b8kg1rYEG4wXTtxY
</commit_message>
<xml_diff>
--- a/certificates/إيمان_بنت_علي_البدر.docx
+++ b/certificates/إيمان_بنت_علي_البدر.docx
@@ -244,7 +244,7 @@
                                 <w:szCs w:val="28"/>
                                 <w14:ligatures w14:val="none"/>
                               </w:rPr>
-                              <w:t>لجنة  الأنشطة الطلابية</w:t>
+                              <w:t>لجنة الأنشطة الطلابية</w:t>
                             </w:r>
                             <w:r>
                               <w:rPr>
@@ -588,7 +588,7 @@
                           <w:szCs w:val="28"/>
                           <w14:ligatures w14:val="none"/>
                         </w:rPr>
-                        <w:t>لجنة  الأنشطة الطلابية</w:t>
+                        <w:t>لجنة الأنشطة الطلابية</w:t>
                       </w:r>
                       <w:r>
                         <w:rPr>

</xml_diff>

<commit_message>
Update certificates with new templates and regenerate all 31
https://claude.ai/code/session_01XbHfH1b8kg1rYEG4wXTtxY
</commit_message>
<xml_diff>
--- a/certificates/إيمان_بنت_علي_البدر.docx
+++ b/certificates/إيمان_بنت_علي_البدر.docx
@@ -1689,7 +1689,7 @@
                           </w:p>
                         </w:txbxContent>
                       </wps:txbx>
-                      <wps:bodyPr rot="0" spcFirstLastPara="0" vertOverflow="overflow" horzOverflow="overflow" vert="horz" wrap="square" lIns="91440" tIns="45720" rIns="91440" bIns="45720" numCol="1" spcCol="0" rtlCol="1" fromWordArt="0" anchor="t" anchorCtr="0" forceAA="0" compatLnSpc="1">
+                      <wps:bodyPr rot="0" spcFirstLastPara="0" vertOverflow="overflow" horzOverflow="overflow" vert="horz" wrap="square" lIns="91440" tIns="45720" rIns="91440" bIns="0" numCol="1" spcCol="0" rtlCol="1" fromWordArt="0" anchor="t" anchorCtr="0" forceAA="0" compatLnSpc="1">
                         <a:prstTxWarp prst="textNoShape">
                           <a:avLst/>
                         </a:prstTxWarp>
@@ -2254,7 +2254,7 @@
                           </w:p>
                         </w:txbxContent>
                       </wps:txbx>
-                      <wps:bodyPr rot="0" spcFirstLastPara="0" vertOverflow="overflow" horzOverflow="overflow" vert="horz" wrap="square" lIns="91440" tIns="45720" rIns="91440" bIns="45720" numCol="1" spcCol="0" rtlCol="1" fromWordArt="0" anchor="t" anchorCtr="0" forceAA="0" compatLnSpc="1">
+                      <wps:bodyPr rot="0" spcFirstLastPara="0" vertOverflow="overflow" horzOverflow="overflow" vert="horz" wrap="square" lIns="91440" tIns="45720" rIns="91440" bIns="0" numCol="1" spcCol="0" rtlCol="1" fromWordArt="0" anchor="t" anchorCtr="0" forceAA="0" compatLnSpc="1">
                         <a:prstTxWarp prst="textNoShape">
                           <a:avLst/>
                         </a:prstTxWarp>

</xml_diff>